<commit_message>
updated design 1 project pages
</commit_message>
<xml_diff>
--- a/docs/projects/design1-turnin.docx
+++ b/docs/projects/design1-turnin.docx
@@ -23,7 +23,7 @@
         <w:pStyle w:val="Date"/>
       </w:pPr>
       <w:r>
-        <w:t xml:space="preserve">2024-09-23</w:t>
+        <w:t xml:space="preserve">2025-09-21</w:t>
       </w:r>
     </w:p>
     <w:bookmarkStart w:id="34" w:name="turn-in-your-design-1"/>
@@ -60,28 +60,38 @@
         <w:t xml:space="preserve"> </w:t>
       </w:r>
       <w:r>
-        <w:t xml:space="preserve">so that your peers can find the correct paper to review. Be sure to put the first author first.</w:t>
-      </w:r>
-    </w:p>
-    <w:p>
-      <w:pPr>
-        <w:pStyle w:val="FirstParagraph"/>
-      </w:pPr>
-      <w:r>
-        <w:t xml:space="preserve">For example:</w:t>
-      </w:r>
-      <w:r>
-        <w:t xml:space="preserve"> </w:t>
-      </w:r>
-      <w:r>
-        <w:t xml:space="preserve">“</w:t>
+        <w:t xml:space="preserve">so that your peers can find the correct paper to review.</w:t>
+      </w:r>
+      <w:r>
+        <w:t xml:space="preserve"> </w:t>
       </w:r>
       <w:r>
         <w:rPr>
           <w:i/>
           <w:iCs/>
         </w:rPr>
-        <w:t xml:space="preserve">Hasegawa_Kondo.pdf</w:t>
+        <w:t xml:space="preserve">Be sure to put the first author first.</w:t>
+      </w:r>
+    </w:p>
+    <w:p>
+      <w:pPr>
+        <w:pStyle w:val="FirstParagraph"/>
+      </w:pPr>
+      <w:r>
+        <w:t xml:space="preserve">For example:</w:t>
+      </w:r>
+      <w:r>
+        <w:t xml:space="preserve"> </w:t>
+      </w:r>
+      <w:r>
+        <w:t xml:space="preserve">“</w:t>
+      </w:r>
+      <w:r>
+        <w:rPr>
+          <w:i/>
+          <w:iCs/>
+        </w:rPr>
+        <w:t xml:space="preserve">Leal_Butler.pdf</w:t>
       </w:r>
       <w:r>
         <w:t xml:space="preserve">”</w:t>
@@ -89,6 +99,7 @@
     </w:p>
     <w:p>
       <w:pPr>
+        <w:pStyle w:val="Compact"/>
         <w:numPr>
           <w:ilvl w:val="0"/>
           <w:numId w:val="1002"/>
@@ -98,28 +109,6 @@
         <w:t xml:space="preserve">Post your draft paper on the shared Google Drive by 5pm Monday. [</w:t>
       </w:r>
       <w:hyperlink r:id="rId20">
-        <w:r>
-          <w:rPr>
-            <w:rStyle w:val="Hyperlink"/>
-          </w:rPr>
-          <w:t xml:space="preserve">Upload here</w:t>
-        </w:r>
-      </w:hyperlink>
-      <w:r>
-        <w:t xml:space="preserve">]</w:t>
-      </w:r>
-    </w:p>
-    <w:p>
-      <w:pPr>
-        <w:numPr>
-          <w:ilvl w:val="0"/>
-          <w:numId w:val="1002"/>
-        </w:numPr>
-      </w:pPr>
-      <w:r>
-        <w:t xml:space="preserve">Post your final draft by midnight on Tuesday 10/1 [</w:t>
-      </w:r>
-      <w:hyperlink r:id="rId21">
         <w:r>
           <w:rPr>
             <w:rStyle w:val="Hyperlink"/>
@@ -182,18 +171,18 @@
                 <wp:inline>
                   <wp:extent cx="152400" cy="152400"/>
                   <wp:effectExtent b="0" l="0" r="0" t="0"/>
-                  <wp:docPr descr="" title="" id="23" name="Picture"/>
+                  <wp:docPr descr="" title="" id="22" name="Picture"/>
                   <a:graphic>
                     <a:graphicData uri="http://schemas.openxmlformats.org/drawingml/2006/picture">
                       <pic:pic>
                         <pic:nvPicPr>
-                          <pic:cNvPr descr="/Applications/quarto/share/formats/docx/note.png" id="24" name="Picture"/>
+                          <pic:cNvPr descr="/Applications/quarto/share/formats/docx/note.png" id="23" name="Picture"/>
                           <pic:cNvPicPr>
                             <a:picLocks noChangeArrowheads="1" noChangeAspect="1"/>
                           </pic:cNvPicPr>
                         </pic:nvPicPr>
                         <pic:blipFill>
-                          <a:blip r:embed="rId22"/>
+                          <a:blip r:embed="rId21"/>
                           <a:stretch>
                             <a:fillRect/>
                           </a:stretch>
@@ -253,7 +242,7 @@
             <w:r>
               <w:t xml:space="preserve">Find your [</w:t>
             </w:r>
-            <w:hyperlink r:id="rId25">
+            <w:hyperlink r:id="rId24">
               <w:r>
                 <w:rPr>
                   <w:rStyle w:val="Hyperlink"/>
@@ -276,12 +265,12 @@
             <w:r>
               <w:t xml:space="preserve">Download your assigned manuscript. [</w:t>
             </w:r>
-            <w:hyperlink r:id="rId20">
+            <w:hyperlink r:id="rId25">
               <w:r>
                 <w:rPr>
                   <w:rStyle w:val="Hyperlink"/>
                 </w:rPr>
-                <w:t xml:space="preserve">Design 1 google drive folder</w:t>
+                <w:t xml:space="preserve">Design google drive folder</w:t>
               </w:r>
             </w:hyperlink>
             <w:r>
@@ -323,7 +312,13 @@
                 <w:b/>
                 <w:bCs/>
               </w:rPr>
-              <w:t xml:space="preserve">Print out the manuscript so that you can write comments directly on the report.</w:t>
+              <w:t xml:space="preserve">Print out one copy of the manuscript so that you can write comments directly on the report.</w:t>
+            </w:r>
+            <w:r>
+              <w:t xml:space="preserve"> </w:t>
+            </w:r>
+            <w:r>
+              <w:t xml:space="preserve">This one will go to the authors.</w:t>
             </w:r>
           </w:p>
         </w:tc>
@@ -892,7 +887,7 @@
         <w:t xml:space="preserve">3 copies of your peer review</w:t>
       </w:r>
       <w:r>
-        <w:t xml:space="preserve">: one each to the two coauthors and myself. (To your colleagues to help them revise their paper and to me to grade your peer review.)</w:t>
+        <w:t xml:space="preserve">: one each to the two coauthors and myself. (to help the authors revise their paper and to me to grade your peer review.)</w:t>
       </w:r>
     </w:p>
     <w:p>

</xml_diff>

<commit_message>
updated the week and design 1 turnin instructions
</commit_message>
<xml_diff>
--- a/docs/projects/design1-turnin.docx
+++ b/docs/projects/design1-turnin.docx
@@ -26,7 +26,7 @@
         <w:t xml:space="preserve">2025-09-21</w:t>
       </w:r>
     </w:p>
-    <w:bookmarkStart w:id="34" w:name="turn-in-your-design-1"/>
+    <w:bookmarkStart w:id="35" w:name="turn-in-your-design-1"/>
     <w:p>
       <w:pPr>
         <w:pStyle w:val="Heading1"/>
@@ -99,7 +99,6 @@
     </w:p>
     <w:p>
       <w:pPr>
-        <w:pStyle w:val="Compact"/>
         <w:numPr>
           <w:ilvl w:val="0"/>
           <w:numId w:val="1002"/>
@@ -120,7 +119,29 @@
         <w:t xml:space="preserve">]</w:t>
       </w:r>
     </w:p>
-    <w:bookmarkStart w:id="33" w:name="complete-your-peer-critique"/>
+    <w:p>
+      <w:pPr>
+        <w:numPr>
+          <w:ilvl w:val="0"/>
+          <w:numId w:val="1002"/>
+        </w:numPr>
+      </w:pPr>
+      <w:r>
+        <w:t xml:space="preserve">Post your final draft by midnight on Friday 10/3 [</w:t>
+      </w:r>
+      <w:hyperlink r:id="rId21">
+        <w:r>
+          <w:rPr>
+            <w:rStyle w:val="Hyperlink"/>
+          </w:rPr>
+          <w:t xml:space="preserve">Upload here</w:t>
+        </w:r>
+      </w:hyperlink>
+      <w:r>
+        <w:t xml:space="preserve">]</w:t>
+      </w:r>
+    </w:p>
+    <w:bookmarkStart w:id="34" w:name="complete-your-peer-critique"/>
     <w:p>
       <w:pPr>
         <w:pStyle w:val="Heading2"/>
@@ -171,18 +192,18 @@
                 <wp:inline>
                   <wp:extent cx="152400" cy="152400"/>
                   <wp:effectExtent b="0" l="0" r="0" t="0"/>
-                  <wp:docPr descr="" title="" id="22" name="Picture"/>
+                  <wp:docPr descr="" title="" id="23" name="Picture"/>
                   <a:graphic>
                     <a:graphicData uri="http://schemas.openxmlformats.org/drawingml/2006/picture">
                       <pic:pic>
                         <pic:nvPicPr>
-                          <pic:cNvPr descr="/Applications/quarto/share/formats/docx/note.png" id="23" name="Picture"/>
+                          <pic:cNvPr descr="/Applications/quarto/share/formats/docx/note.png" id="24" name="Picture"/>
                           <pic:cNvPicPr>
                             <a:picLocks noChangeArrowheads="1" noChangeAspect="1"/>
                           </pic:cNvPicPr>
                         </pic:nvPicPr>
                         <pic:blipFill>
-                          <a:blip r:embed="rId21"/>
+                          <a:blip r:embed="rId22"/>
                           <a:stretch>
                             <a:fillRect/>
                           </a:stretch>
@@ -242,7 +263,7 @@
             <w:r>
               <w:t xml:space="preserve">Find your [</w:t>
             </w:r>
-            <w:hyperlink r:id="rId24">
+            <w:hyperlink r:id="rId25">
               <w:r>
                 <w:rPr>
                   <w:rStyle w:val="Hyperlink"/>
@@ -265,7 +286,7 @@
             <w:r>
               <w:t xml:space="preserve">Download your assigned manuscript. [</w:t>
             </w:r>
-            <w:hyperlink r:id="rId25">
+            <w:hyperlink r:id="rId26">
               <w:r>
                 <w:rPr>
                   <w:rStyle w:val="Hyperlink"/>
@@ -288,7 +309,7 @@
             <w:r>
               <w:t xml:space="preserve">[</w:t>
             </w:r>
-            <w:hyperlink r:id="rId26">
+            <w:hyperlink r:id="rId27">
               <w:r>
                 <w:rPr>
                   <w:rStyle w:val="Hyperlink"/>
@@ -324,7 +345,7 @@
         </w:tc>
       </w:tr>
     </w:tbl>
-    <w:bookmarkStart w:id="28" w:name="read-through-the-content-guidelines."/>
+    <w:bookmarkStart w:id="29" w:name="read-through-the-content-guidelines."/>
     <w:p>
       <w:pPr>
         <w:pStyle w:val="Heading3"/>
@@ -336,7 +357,7 @@
         </w:rPr>
         <w:t xml:space="preserve">Read through the [</w:t>
       </w:r>
-      <w:hyperlink r:id="rId27">
+      <w:hyperlink r:id="rId28">
         <w:r>
           <w:rPr>
             <w:rStyle w:val="Hyperlink"/>
@@ -357,8 +378,8 @@
         <w:t xml:space="preserve">.</w:t>
       </w:r>
     </w:p>
-    <w:bookmarkEnd w:id="28"/>
-    <w:bookmarkStart w:id="29" w:name="Xd5f91c86ea094ab2265544bd898bbb2ebbae2ee"/>
+    <w:bookmarkEnd w:id="29"/>
+    <w:bookmarkStart w:id="30" w:name="Xd5f91c86ea094ab2265544bd898bbb2ebbae2ee"/>
     <w:p>
       <w:pPr>
         <w:pStyle w:val="Heading3"/>
@@ -523,8 +544,8 @@
         <w:t xml:space="preserve">When you receive your critique, it really helps to have a thick skin – we are working together to help each other produce the best final draft possible.</w:t>
       </w:r>
     </w:p>
-    <w:bookmarkEnd w:id="29"/>
-    <w:bookmarkStart w:id="30" w:name="Xcf31fb6b647229dba3ac21e77dbd72f061c64f9"/>
+    <w:bookmarkEnd w:id="30"/>
+    <w:bookmarkStart w:id="31" w:name="Xcf31fb6b647229dba3ac21e77dbd72f061c64f9"/>
     <w:p>
       <w:pPr>
         <w:pStyle w:val="Heading3"/>
@@ -778,8 +799,8 @@
         <w:t xml:space="preserve">. However, if there are problems in other areas, please tell them clearly.</w:t>
       </w:r>
     </w:p>
-    <w:bookmarkEnd w:id="30"/>
-    <w:bookmarkStart w:id="31" w:name="X2594c2222946ab703e0a3fae54ca7f3d29e1406"/>
+    <w:bookmarkEnd w:id="31"/>
+    <w:bookmarkStart w:id="32" w:name="X2594c2222946ab703e0a3fae54ca7f3d29e1406"/>
     <w:p>
       <w:pPr>
         <w:pStyle w:val="Heading3"/>
@@ -849,8 +870,8 @@
         <w:t xml:space="preserve">, including the reasonableness of the grade you assign.</w:t>
       </w:r>
     </w:p>
-    <w:bookmarkEnd w:id="31"/>
-    <w:bookmarkStart w:id="32" w:name="bring-to-lab"/>
+    <w:bookmarkEnd w:id="32"/>
+    <w:bookmarkStart w:id="33" w:name="bring-to-lab"/>
     <w:p>
       <w:pPr>
         <w:pStyle w:val="Heading3"/>
@@ -898,9 +919,9 @@
         <w:t xml:space="preserve">Thanks! Marguerite</w:t>
       </w:r>
     </w:p>
-    <w:bookmarkEnd w:id="32"/>
     <w:bookmarkEnd w:id="33"/>
     <w:bookmarkEnd w:id="34"/>
+    <w:bookmarkEnd w:id="35"/>
     <w:sectPr/>
   </w:body>
 </w:document>

</xml_diff>